<commit_message>
Add Out-of-Scope note for remaining PA3 Use Cases to Test Plan
</commit_message>
<xml_diff>
--- a/pa/pa4/Test plan.docx
+++ b/pa/pa4/Test plan.docx
@@ -3486,6 +3486,11 @@
       </w:r>
     </w:p>
     <w:p>
+      <w:r>
+        <w:t>Note: Out of the 15 Use Cases defined in the Software Architecture Document (PA3), the 6 Core Feature Areas above are implemented and targeted for PA4 testing (MVP). The remaining Use Cases are considered Out of Scope for this iteration and deferred to future releases.</w:t>
+      </w:r>
+    </w:p>
+    <w:p>
       <w:pPr>
         <w:rPr>
           <w:rFonts w:ascii="Arial" w:cs="Arial" w:eastAsia="Arial" w:hAnsi="Arial"/>

</xml_diff>